<commit_message>
Audit: figure citation order, exact wording checks, reference checker strips Crossref HTML
- figures first cited in numerical order (Springer requirement)
- reference checker: strip HTML tags from Crossref titles; accept titles with
  an appended footnote when the first 60 characters match

Co-Authored-By: Claude Opus 5.5 <noreply@anthropic.com>
</commit_message>
<xml_diff>
--- a/manuscript/submission/Manuscript_TNBC_B36N36_JMM.docx
+++ b/manuscript/submission/Manuscript_TNBC_B36N36_JMM.docx
@@ -781,11 +781,21 @@
     </w:p>
     <w:p>
       <w:pPr>
+        <w:ind w:firstLine="340"/>
+        <w:jc w:val="both"/>
+      </w:pPr>
+      <w:r>
+        <w:rPr/>
+        <w:t>The workflow is summarised in Fig. 1. All quantities are computed; none is fitted to experimental data.</w:t>
+      </w:r>
+    </w:p>
+    <w:p>
+      <w:pPr>
         <w:pStyle w:val="Heading2"/>
       </w:pPr>
       <w:r>
         <w:rPr/>
-        <w:t>Validated docking into the PARP1 nicotinamide pocket</w:t>
+        <w:t>Electronic descriptors of the drugs</w:t>
       </w:r>
     </w:p>
     <w:p>
@@ -795,47 +805,7 @@
       </w:pPr>
       <w:r>
         <w:rPr/>
-        <w:t>Self-redocking of talazoparib from its crystal conformation reproduced the deposited pose with a heavy-atom RMSD of 0.51 Å (−11.9 kcal mol</w:t>
-      </w:r>
-      <w:r>
-        <w:rPr>
-          <w:vertAlign w:val="superscript"/>
-        </w:rPr>
-        <w:t>−1</w:t>
-      </w:r>
-      <w:r>
-        <w:rPr/>
-        <w:t>), and the same ligand rebuilt from SMILES through the production protocol reached 1.27 Å (Fig. 3a), both within the usual 2 Å criterion. The ring-conformer ensemble was necessary: a single ETKDG conformer of talazoparib, whose partially saturated ring Vina cannot flex, docked 6.7 Å away from the crystal pose. Across the 30 drugs, the most frequently contacted residues were Tyr907, Tyr896, His862, Tyr889, Asp766, Gly863 (Fig. 3b), the nicotinamide-site residues that anchor clinical PARP inhibitors. Scores ranged from −12.8 to −7.8 kcal mol</w:t>
-      </w:r>
-      <w:r>
-        <w:rPr>
-          <w:vertAlign w:val="superscript"/>
-        </w:rPr>
-        <w:t>−1</w:t>
-      </w:r>
-      <w:r>
-        <w:rPr/>
-        <w:t xml:space="preserve"> (Table 1, Fig. 4a). The two best-scoring drugs were the approved PARP inhibitors olaparib (−12.8) and talazoparib (−12.2 kcal mol</w:t>
-      </w:r>
-      <w:r>
-        <w:rPr>
-          <w:vertAlign w:val="superscript"/>
-        </w:rPr>
-        <w:t>−1</w:t>
-      </w:r>
-      <w:r>
-        <w:rPr/>
-        <w:t xml:space="preserve">), a useful plausibility check, although the three families did not differ significantly (Kruskal–Wallis </w:t>
-      </w:r>
-      <w:r>
-        <w:rPr>
-          <w:i/>
-        </w:rPr>
-        <w:t>p</w:t>
-      </w:r>
-      <w:r>
-        <w:rPr/>
-        <w:t xml:space="preserve"> = 0.22).</w:t>
+        <w:t>All drug LUMOs lie below the LUMO of the cage (−6.08 eV), and all HOMOs lie above the cage HOMO (−10.38 eV) except those of olaparib, talazoparib, paclitaxel, SN-38 and exatecan (Fig. 2a): the frontier levels of the drugs fall largely inside the wide gap of the cage. The anthracyclines epirubicin and doxorubicin are the softest and most electrophilic molecules of the set (Fig. 2b).</w:t>
       </w:r>
     </w:p>
     <w:p>
@@ -846,8 +816,184 @@
       <w:r>
         <w:drawing>
           <wp:inline xmlns:a="http://schemas.openxmlformats.org/drawingml/2006/main" xmlns:pic="http://schemas.openxmlformats.org/drawingml/2006/picture">
+            <wp:extent cx="6264000" cy="3460582"/>
+            <wp:docPr id="2" name="Picture 2"/>
+            <wp:cNvGraphicFramePr>
+              <a:graphicFrameLocks noChangeAspect="1"/>
+            </wp:cNvGraphicFramePr>
+            <a:graphic>
+              <a:graphicData uri="http://schemas.openxmlformats.org/drawingml/2006/picture">
+                <pic:pic>
+                  <pic:nvPicPr>
+                    <pic:cNvPr id="0" name="Fig2.png"/>
+                    <pic:cNvPicPr/>
+                  </pic:nvPicPr>
+                  <pic:blipFill>
+                    <a:blip r:embed="rId11"/>
+                    <a:stretch>
+                      <a:fillRect/>
+                    </a:stretch>
+                  </pic:blipFill>
+                  <pic:spPr>
+                    <a:xfrm>
+                      <a:off x="0" y="0"/>
+                      <a:ext cx="6264000" cy="3460582"/>
+                    </a:xfrm>
+                    <a:prstGeom prst="rect"/>
+                  </pic:spPr>
+                </pic:pic>
+              </a:graphicData>
+            </a:graphic>
+          </wp:inline>
+        </w:drawing>
+      </w:r>
+    </w:p>
+    <w:p>
+      <w:pPr>
+        <w:spacing w:after="240" w:line="276" w:lineRule="auto"/>
+        <w:jc w:val="both"/>
+      </w:pPr>
+      <w:r>
+        <w:rPr>
+          <w:b/>
+          <w:sz w:val="20"/>
+        </w:rPr>
+        <w:t>Fig. 2</w:t>
+      </w:r>
+      <w:r>
+        <w:rPr>
+          <w:sz w:val="20"/>
+        </w:rPr>
+        <w:t xml:space="preserve"> </w:t>
+      </w:r>
+      <w:r>
+        <w:rPr>
+          <w:sz w:val="20"/>
+        </w:rPr>
+        <w:t xml:space="preserve">GFN2-xTB frontier orbitals of the relaxed drugs. </w:t>
+      </w:r>
+      <w:r>
+        <w:rPr>
+          <w:b/>
+          <w:sz w:val="20"/>
+        </w:rPr>
+        <w:t>a</w:t>
+      </w:r>
+      <w:r>
+        <w:rPr>
+          <w:sz w:val="20"/>
+        </w:rPr>
+        <w:t xml:space="preserve"> HOMO (circles) and LUMO (squares) of each drug, sorted by gap and coloured by family; dashed lines, HOMO and LUMO of the B</w:t>
+      </w:r>
+      <w:r>
+        <w:rPr>
+          <w:sz w:val="20"/>
+          <w:vertAlign w:val="subscript"/>
+        </w:rPr>
+        <w:t>36</w:t>
+      </w:r>
+      <w:r>
+        <w:rPr>
+          <w:sz w:val="20"/>
+        </w:rPr>
+        <w:t>N</w:t>
+      </w:r>
+      <w:r>
+        <w:rPr>
+          <w:sz w:val="20"/>
+          <w:vertAlign w:val="subscript"/>
+        </w:rPr>
+        <w:t>36</w:t>
+      </w:r>
+      <w:r>
+        <w:rPr>
+          <w:sz w:val="20"/>
+        </w:rPr>
+        <w:t xml:space="preserve"> cage. </w:t>
+      </w:r>
+      <w:r>
+        <w:rPr>
+          <w:b/>
+          <w:sz w:val="20"/>
+        </w:rPr>
+        <w:t>b</w:t>
+      </w:r>
+      <w:r>
+        <w:rPr>
+          <w:sz w:val="20"/>
+        </w:rPr>
+        <w:t xml:space="preserve"> Chemical hardness η versus electrophilicity ω</w:t>
+      </w:r>
+    </w:p>
+    <w:p>
+      <w:pPr>
+        <w:pStyle w:val="Heading2"/>
+      </w:pPr>
+      <w:r>
+        <w:rPr/>
+        <w:t>Validated docking into the PARP1 nicotinamide pocket</w:t>
+      </w:r>
+    </w:p>
+    <w:p>
+      <w:pPr>
+        <w:ind w:firstLine="340"/>
+        <w:jc w:val="both"/>
+      </w:pPr>
+      <w:r>
+        <w:rPr/>
+        <w:t>Self-redocking of talazoparib from its crystal conformation reproduced the deposited pose with a heavy-atom RMSD of 0.51 Å (−11.9 kcal mol</w:t>
+      </w:r>
+      <w:r>
+        <w:rPr>
+          <w:vertAlign w:val="superscript"/>
+        </w:rPr>
+        <w:t>−1</w:t>
+      </w:r>
+      <w:r>
+        <w:rPr/>
+        <w:t>), and the same ligand rebuilt from SMILES through the production protocol reached 1.27 Å (Fig. 3a), both within the usual 2 Å criterion. The ring-conformer ensemble was necessary: a single ETKDG conformer of talazoparib, whose partially saturated ring Vina cannot flex, docked 6.7 Å away from the crystal pose. Across the 30 drugs, the most frequently contacted residues were Tyr907, Tyr896, His862, Tyr889, Asp766, Gly863 (Fig. 3b), the nicotinamide-site residues that anchor clinical PARP inhibitors. Scores ranged from −12.8 to −7.8 kcal mol</w:t>
+      </w:r>
+      <w:r>
+        <w:rPr>
+          <w:vertAlign w:val="superscript"/>
+        </w:rPr>
+        <w:t>−1</w:t>
+      </w:r>
+      <w:r>
+        <w:rPr/>
+        <w:t xml:space="preserve"> (Table 1, Fig. 4a). The two best-scoring drugs were the approved PARP inhibitors olaparib (−12.8) and talazoparib (−12.2 kcal mol</w:t>
+      </w:r>
+      <w:r>
+        <w:rPr>
+          <w:vertAlign w:val="superscript"/>
+        </w:rPr>
+        <w:t>−1</w:t>
+      </w:r>
+      <w:r>
+        <w:rPr/>
+        <w:t xml:space="preserve">), a useful plausibility check, although the three families did not differ significantly (Kruskal–Wallis </w:t>
+      </w:r>
+      <w:r>
+        <w:rPr>
+          <w:i/>
+        </w:rPr>
+        <w:t>p</w:t>
+      </w:r>
+      <w:r>
+        <w:rPr/>
+        <w:t xml:space="preserve"> = 0.22).</w:t>
+      </w:r>
+    </w:p>
+    <w:p>
+      <w:pPr>
+        <w:keepNext/>
+        <w:jc w:val="center"/>
+      </w:pPr>
+      <w:r>
+        <w:drawing>
+          <wp:inline xmlns:a="http://schemas.openxmlformats.org/drawingml/2006/main" xmlns:pic="http://schemas.openxmlformats.org/drawingml/2006/picture">
             <wp:extent cx="6264000" cy="2860638"/>
-            <wp:docPr id="2" name="Picture 2"/>
+            <wp:docPr id="3" name="Picture 3"/>
             <wp:cNvGraphicFramePr>
               <a:graphicFrameLocks noChangeAspect="1"/>
             </wp:cNvGraphicFramePr>
@@ -859,7 +1005,7 @@
                     <pic:cNvPicPr/>
                   </pic:nvPicPr>
                   <pic:blipFill>
-                    <a:blip r:embed="rId11"/>
+                    <a:blip r:embed="rId12"/>
                     <a:stretch>
                       <a:fillRect/>
                     </a:stretch>
@@ -931,33 +1077,14 @@
     </w:p>
     <w:p>
       <w:pPr>
-        <w:pStyle w:val="Heading2"/>
-      </w:pPr>
-      <w:r>
-        <w:rPr/>
-        <w:t>Electronic descriptors of the drugs</w:t>
-      </w:r>
-    </w:p>
-    <w:p>
-      <w:pPr>
-        <w:ind w:firstLine="340"/>
-        <w:jc w:val="both"/>
-      </w:pPr>
-      <w:r>
-        <w:rPr/>
-        <w:t>All drug LUMOs lie below the LUMO of the cage (−6.08 eV), and all HOMOs lie above the cage HOMO (−10.38 eV) except those of olaparib, talazoparib, paclitaxel, sn-38 and exatecan (Fig. 2a): the frontier levels of the drugs fall largely inside the wide gap of the cage. The anthracyclines epirubicin and doxorubicin are the softest and most electrophilic molecules of the set (Fig. 2b).</w:t>
-      </w:r>
-    </w:p>
-    <w:p>
-      <w:pPr>
         <w:keepNext/>
         <w:jc w:val="center"/>
       </w:pPr>
       <w:r>
         <w:drawing>
           <wp:inline xmlns:a="http://schemas.openxmlformats.org/drawingml/2006/main" xmlns:pic="http://schemas.openxmlformats.org/drawingml/2006/picture">
-            <wp:extent cx="6264000" cy="3460582"/>
-            <wp:docPr id="3" name="Picture 3"/>
+            <wp:extent cx="6264000" cy="3415811"/>
+            <wp:docPr id="4" name="Picture 4"/>
             <wp:cNvGraphicFramePr>
               <a:graphicFrameLocks noChangeAspect="1"/>
             </wp:cNvGraphicFramePr>
@@ -965,11 +1092,11 @@
               <a:graphicData uri="http://schemas.openxmlformats.org/drawingml/2006/picture">
                 <pic:pic>
                   <pic:nvPicPr>
-                    <pic:cNvPr id="0" name="Fig2.png"/>
+                    <pic:cNvPr id="0" name="Fig4.png"/>
                     <pic:cNvPicPr/>
                   </pic:nvPicPr>
                   <pic:blipFill>
-                    <a:blip r:embed="rId12"/>
+                    <a:blip r:embed="rId13"/>
                     <a:stretch>
                       <a:fillRect/>
                     </a:stretch>
@@ -977,7 +1104,7 @@
                   <pic:spPr>
                     <a:xfrm>
                       <a:off x="0" y="0"/>
-                      <a:ext cx="6264000" cy="3460582"/>
+                      <a:ext cx="6264000" cy="3415811"/>
                     </a:xfrm>
                     <a:prstGeom prst="rect"/>
                   </pic:spPr>
@@ -998,19 +1125,13 @@
           <w:b/>
           <w:sz w:val="20"/>
         </w:rPr>
-        <w:t>Fig. 2</w:t>
+        <w:t>Fig. 4</w:t>
       </w:r>
       <w:r>
         <w:rPr>
           <w:sz w:val="20"/>
         </w:rPr>
         <w:t xml:space="preserve"> </w:t>
-      </w:r>
-      <w:r>
-        <w:rPr>
-          <w:sz w:val="20"/>
-        </w:rPr>
-        <w:t xml:space="preserve">GFN2-xTB frontier orbitals of the relaxed drugs. </w:t>
       </w:r>
       <w:r>
         <w:rPr>
@@ -1023,7 +1144,40 @@
         <w:rPr>
           <w:sz w:val="20"/>
         </w:rPr>
-        <w:t xml:space="preserve"> HOMO (circles) and LUMO (squares) of each drug, sorted by gap and coloured by family; dashed lines, HOMO and LUMO of the B</w:t>
+        <w:t xml:space="preserve"> Vina scores of the drugs in PARP1, coloured by family. </w:t>
+      </w:r>
+      <w:r>
+        <w:rPr>
+          <w:b/>
+          <w:sz w:val="20"/>
+        </w:rPr>
+        <w:t>b</w:t>
+      </w:r>
+      <w:r>
+        <w:rPr>
+          <w:sz w:val="20"/>
+        </w:rPr>
+        <w:t xml:space="preserve"> Vina score versus −Δ</w:t>
+      </w:r>
+      <w:r>
+        <w:rPr>
+          <w:i/>
+          <w:sz w:val="20"/>
+        </w:rPr>
+        <w:t>E</w:t>
+      </w:r>
+      <w:r>
+        <w:rPr>
+          <w:sz w:val="20"/>
+          <w:vertAlign w:val="subscript"/>
+        </w:rPr>
+        <w:t>int</w:t>
+      </w:r>
+      <w:r>
+        <w:rPr>
+          <w:sz w:val="20"/>
+        </w:rPr>
+        <w:t xml:space="preserve"> on B</w:t>
       </w:r>
       <w:r>
         <w:rPr>
@@ -1049,20 +1203,7 @@
         <w:rPr>
           <w:sz w:val="20"/>
         </w:rPr>
-        <w:t xml:space="preserve"> cage. </w:t>
-      </w:r>
-      <w:r>
-        <w:rPr>
-          <w:b/>
-          <w:sz w:val="20"/>
-        </w:rPr>
-        <w:t>b</w:t>
-      </w:r>
-      <w:r>
-        <w:rPr>
-          <w:sz w:val="20"/>
-        </w:rPr>
-        <w:t xml:space="preserve"> Chemical hardness η versus electrophilicity ω</w:t>
+        <w:t>; open symbols, chemisorbed drugs</w:t>
       </w:r>
     </w:p>
     <w:p>
@@ -1127,7 +1268,7 @@
       </w:r>
       <w:r>
         <w:rPr/>
-        <w:t xml:space="preserve"> and closest contacts of 1.76–3.28 Å, whereas 12 formed a bond to a cage boron atom: 8 B–O and 5 B–N dative bonds of 1.43–1.74 Å (Fig. 6a, Table 1). Carbonyl or hydroxyl oxygens and nitrogen lone pairs of the drugs act as the Lewis bases, as expected for the electron-deficient boron sites of BN cages. Chemisorption strengthens the interaction by a factor of about 1.8 (mean −46.5 versus −26.2 kcal mol</w:t>
+        <w:t xml:space="preserve"> and closest contacts of 1.76–3.28 Å (the shortest, SN-38, lies just above the B–O bonding threshold of 1.73 Å), whereas 12 formed a bond to a cage boron atom: 8 B–O and 5 B–N dative bonds of 1.43–1.74 Å (Fig. 6a, Table 1). Carbonyl or hydroxyl oxygens and nitrogen lone pairs of the drugs act as the Lewis bases, as expected for the electron-deficient boron sites of BN cages. Chemisorption strengthens the interaction by a factor of about 1.8 (mean −46.5 versus −26.2 kcal mol</w:t>
       </w:r>
       <w:r>
         <w:rPr>
@@ -1147,7 +1288,17 @@
       </w:r>
       <w:r>
         <w:rPr/>
-        <w:t>), because it also counts the deformation that the dative bond imposes on the drug and on the cage. All three families contain both regimes (Fig. 6b).</w:t>
+        <w:t>), because it also counts the deformation that the dative bond imposes on the drug and on the cage. All three families contain both regimes (Fig. 6b). The cage stays intact throughout: in every complex it keeps its 108 B–N bonds and forms no B–B or N–N bond, and its energy never falls below that of the isolated cage (from 0.0 to 31.6 kcal mol</w:t>
+      </w:r>
+      <w:r>
+        <w:rPr>
+          <w:vertAlign w:val="superscript"/>
+        </w:rPr>
+        <w:t>−1</w:t>
+      </w:r>
+      <w:r>
+        <w:rPr/>
+        <w:t xml:space="preserve"> above it, the cost of its distortion).</w:t>
       </w:r>
     </w:p>
     <w:p>
@@ -1185,7 +1336,7 @@
         <w:drawing>
           <wp:inline xmlns:a="http://schemas.openxmlformats.org/drawingml/2006/main" xmlns:pic="http://schemas.openxmlformats.org/drawingml/2006/picture">
             <wp:extent cx="6264000" cy="1680208"/>
-            <wp:docPr id="4" name="Picture 4"/>
+            <wp:docPr id="5" name="Picture 5"/>
             <wp:cNvGraphicFramePr>
               <a:graphicFrameLocks noChangeAspect="1"/>
             </wp:cNvGraphicFramePr>
@@ -1197,7 +1348,7 @@
                     <pic:cNvPicPr/>
                   </pic:nvPicPr>
                   <pic:blipFill>
-                    <a:blip r:embed="rId13"/>
+                    <a:blip r:embed="rId14"/>
                     <a:stretch>
                       <a:fillRect/>
                     </a:stretch>
@@ -1328,7 +1479,7 @@
         <w:drawing>
           <wp:inline xmlns:a="http://schemas.openxmlformats.org/drawingml/2006/main" xmlns:pic="http://schemas.openxmlformats.org/drawingml/2006/picture">
             <wp:extent cx="6264000" cy="2848912"/>
-            <wp:docPr id="5" name="Picture 5"/>
+            <wp:docPr id="6" name="Picture 6"/>
             <wp:cNvGraphicFramePr>
               <a:graphicFrameLocks noChangeAspect="1"/>
             </wp:cNvGraphicFramePr>
@@ -1340,7 +1491,7 @@
                     <pic:cNvPicPr/>
                   </pic:nvPicPr>
                   <pic:blipFill>
-                    <a:blip r:embed="rId14"/>
+                    <a:blip r:embed="rId15"/>
                     <a:stretch>
                       <a:fillRect/>
                     </a:stretch>
@@ -1507,137 +1658,6 @@
     </w:p>
     <w:p>
       <w:pPr>
-        <w:keepNext/>
-        <w:jc w:val="center"/>
-      </w:pPr>
-      <w:r>
-        <w:drawing>
-          <wp:inline xmlns:a="http://schemas.openxmlformats.org/drawingml/2006/main" xmlns:pic="http://schemas.openxmlformats.org/drawingml/2006/picture">
-            <wp:extent cx="6264000" cy="3415811"/>
-            <wp:docPr id="6" name="Picture 6"/>
-            <wp:cNvGraphicFramePr>
-              <a:graphicFrameLocks noChangeAspect="1"/>
-            </wp:cNvGraphicFramePr>
-            <a:graphic>
-              <a:graphicData uri="http://schemas.openxmlformats.org/drawingml/2006/picture">
-                <pic:pic>
-                  <pic:nvPicPr>
-                    <pic:cNvPr id="0" name="Fig4.png"/>
-                    <pic:cNvPicPr/>
-                  </pic:nvPicPr>
-                  <pic:blipFill>
-                    <a:blip r:embed="rId15"/>
-                    <a:stretch>
-                      <a:fillRect/>
-                    </a:stretch>
-                  </pic:blipFill>
-                  <pic:spPr>
-                    <a:xfrm>
-                      <a:off x="0" y="0"/>
-                      <a:ext cx="6264000" cy="3415811"/>
-                    </a:xfrm>
-                    <a:prstGeom prst="rect"/>
-                  </pic:spPr>
-                </pic:pic>
-              </a:graphicData>
-            </a:graphic>
-          </wp:inline>
-        </w:drawing>
-      </w:r>
-    </w:p>
-    <w:p>
-      <w:pPr>
-        <w:spacing w:after="240" w:line="276" w:lineRule="auto"/>
-        <w:jc w:val="both"/>
-      </w:pPr>
-      <w:r>
-        <w:rPr>
-          <w:b/>
-          <w:sz w:val="20"/>
-        </w:rPr>
-        <w:t>Fig. 4</w:t>
-      </w:r>
-      <w:r>
-        <w:rPr>
-          <w:sz w:val="20"/>
-        </w:rPr>
-        <w:t xml:space="preserve"> </w:t>
-      </w:r>
-      <w:r>
-        <w:rPr>
-          <w:b/>
-          <w:sz w:val="20"/>
-        </w:rPr>
-        <w:t>a</w:t>
-      </w:r>
-      <w:r>
-        <w:rPr>
-          <w:sz w:val="20"/>
-        </w:rPr>
-        <w:t xml:space="preserve"> Vina scores of the drugs in PARP1, coloured by family. </w:t>
-      </w:r>
-      <w:r>
-        <w:rPr>
-          <w:b/>
-          <w:sz w:val="20"/>
-        </w:rPr>
-        <w:t>b</w:t>
-      </w:r>
-      <w:r>
-        <w:rPr>
-          <w:sz w:val="20"/>
-        </w:rPr>
-        <w:t xml:space="preserve"> Vina score versus −Δ</w:t>
-      </w:r>
-      <w:r>
-        <w:rPr>
-          <w:i/>
-          <w:sz w:val="20"/>
-        </w:rPr>
-        <w:t>E</w:t>
-      </w:r>
-      <w:r>
-        <w:rPr>
-          <w:sz w:val="20"/>
-          <w:vertAlign w:val="subscript"/>
-        </w:rPr>
-        <w:t>int</w:t>
-      </w:r>
-      <w:r>
-        <w:rPr>
-          <w:sz w:val="20"/>
-        </w:rPr>
-        <w:t xml:space="preserve"> on B</w:t>
-      </w:r>
-      <w:r>
-        <w:rPr>
-          <w:sz w:val="20"/>
-          <w:vertAlign w:val="subscript"/>
-        </w:rPr>
-        <w:t>36</w:t>
-      </w:r>
-      <w:r>
-        <w:rPr>
-          <w:sz w:val="20"/>
-        </w:rPr>
-        <w:t>N</w:t>
-      </w:r>
-      <w:r>
-        <w:rPr>
-          <w:sz w:val="20"/>
-          <w:vertAlign w:val="subscript"/>
-        </w:rPr>
-        <w:t>36</w:t>
-      </w:r>
-      <w:r>
-        <w:rPr>
-          <w:sz w:val="20"/>
-        </w:rPr>
-        <w:t>; open symbols, chemisorbed drugs</w:t>
-      </w:r>
-    </w:p>
-    <w:p>
-      <w:pPr>
         <w:pStyle w:val="Heading2"/>
       </w:pPr>
       <w:r>
@@ -1740,7 +1760,7 @@
       </w:r>
       <w:r>
         <w:rPr/>
-        <w:t xml:space="preserve"> = 0.35 and 0.32; Fig. 7, Table 2). The adsorption result is chemically reasonable: whether a drug chemisorbs depends on whether one of its Lewis-basic groups can reach a boron atom in a favourable geometry, a local structural feature that global descriptors such as molecular weight or electrophilicity do not encode. All but one drug (Epirubicin) lie inside the applicability domain, so the failure is not an extrapolation effect. These negative results are reported as such; they indicate that screening B</w:t>
+        <w:t xml:space="preserve"> = 0.35 and 0.32; Fig. 7, Table 2). The adsorption result is chemically reasonable: whether a drug chemisorbs depends on whether one of its Lewis-basic groups can reach a boron atom in a favourable geometry, a local structural feature that global descriptors such as molecular weight or electrophilicity do not encode. In both models all drugs except epirubicin lie inside the applicability domain, so the failure is not an extrapolation effect. These negative results are reported as such; they indicate that screening B</w:t>
       </w:r>
       <w:r>
         <w:rPr>
@@ -6727,7 +6747,7 @@
         <w:rPr>
           <w:sz w:val="17"/>
         </w:rPr>
-        <w:t xml:space="preserve">, fraction of permutations reaching the model's </w:t>
+        <w:t xml:space="preserve"> = (1 + number of permutations reaching the model's </w:t>
       </w:r>
       <w:r>
         <w:rPr>
@@ -6754,7 +6774,7 @@
         <w:rPr>
           <w:sz w:val="17"/>
         </w:rPr>
-        <w:t>; In AD, drugs inside the applicability domain.</w:t>
+        <w:t>)/1,001; In AD, drugs inside the applicability domain.</w:t>
       </w:r>
     </w:p>
     <w:p>

</xml_diff>

<commit_message>
TNBC audit: figure layout (panel letters, scrambling label inside null distribution), cage-integrity statement, SN-38 contact note
Co-Authored-By: Claude Opus 5.5 <noreply@anthropic.com>
</commit_message>
<xml_diff>
--- a/manuscript/submission/Manuscript_TNBC_B36N36_JMM.docx
+++ b/manuscript/submission/Manuscript_TNBC_B36N36_JMM.docx
@@ -1083,7 +1083,7 @@
       <w:r>
         <w:drawing>
           <wp:inline xmlns:a="http://schemas.openxmlformats.org/drawingml/2006/main" xmlns:pic="http://schemas.openxmlformats.org/drawingml/2006/picture">
-            <wp:extent cx="6264000" cy="3415811"/>
+            <wp:extent cx="6264000" cy="3343599"/>
             <wp:docPr id="4" name="Picture 4"/>
             <wp:cNvGraphicFramePr>
               <a:graphicFrameLocks noChangeAspect="1"/>
@@ -1104,7 +1104,7 @@
                   <pic:spPr>
                     <a:xfrm>
                       <a:off x="0" y="0"/>
-                      <a:ext cx="6264000" cy="3415811"/>
+                      <a:ext cx="6264000" cy="3343599"/>
                     </a:xfrm>
                     <a:prstGeom prst="rect"/>
                   </pic:spPr>
@@ -1791,7 +1791,7 @@
       <w:r>
         <w:drawing>
           <wp:inline xmlns:a="http://schemas.openxmlformats.org/drawingml/2006/main" xmlns:pic="http://schemas.openxmlformats.org/drawingml/2006/picture">
-            <wp:extent cx="6264000" cy="3893418"/>
+            <wp:extent cx="6264000" cy="4280952"/>
             <wp:docPr id="7" name="Picture 7"/>
             <wp:cNvGraphicFramePr>
               <a:graphicFrameLocks noChangeAspect="1"/>
@@ -1812,7 +1812,7 @@
                   <pic:spPr>
                     <a:xfrm>
                       <a:off x="0" y="0"/>
-                      <a:ext cx="6264000" cy="3893418"/>
+                      <a:ext cx="6264000" cy="4280952"/>
                     </a:xfrm>
                     <a:prstGeom prst="rect"/>
                   </pic:spPr>

</xml_diff>

<commit_message>
figures: Springer lettering and width; cage without false B-B/N-N bonds; readable labels
- style.save(): true minus signs, 7 pt minimum lettering, 174 mm double column
- render3d: B...B / N...N contacts across the four-membered rings of the BN cage are
  no longer drawn as bonds (PyMOL distance bonding); stale renders archived
- complexes rendered along the cage-drug axis, so the contact is visible (Figs. 1, 5)
- Fig. 6a: chemisorbed drugs labelled in a column with leader lines
- Fig. 1 card text fits at 7 pt; Fig. 3a legend names talazoparib (PDB 4UND)

Co-Authored-By: Claude Opus 5.5 <noreply@anthropic.com>
</commit_message>
<xml_diff>
--- a/manuscript/submission/Manuscript_TNBC_B36N36_JMM.docx
+++ b/manuscript/submission/Manuscript_TNBC_B36N36_JMM.docx
@@ -379,7 +379,7 @@
       <w:r>
         <w:drawing>
           <wp:inline xmlns:a="http://schemas.openxmlformats.org/drawingml/2006/main" xmlns:pic="http://schemas.openxmlformats.org/drawingml/2006/picture">
-            <wp:extent cx="6264000" cy="2112244"/>
+            <wp:extent cx="6264000" cy="2124578"/>
             <wp:docPr id="1" name="Picture 1"/>
             <wp:cNvGraphicFramePr>
               <a:graphicFrameLocks noChangeAspect="1"/>
@@ -400,7 +400,7 @@
                   <pic:spPr>
                     <a:xfrm>
                       <a:off x="0" y="0"/>
-                      <a:ext cx="6264000" cy="2112244"/>
+                      <a:ext cx="6264000" cy="2124578"/>
                     </a:xfrm>
                     <a:prstGeom prst="rect"/>
                   </pic:spPr>
@@ -834,7 +834,7 @@
       <w:r>
         <w:drawing>
           <wp:inline xmlns:a="http://schemas.openxmlformats.org/drawingml/2006/main" xmlns:pic="http://schemas.openxmlformats.org/drawingml/2006/picture">
-            <wp:extent cx="6264000" cy="3460582"/>
+            <wp:extent cx="6264000" cy="3607320"/>
             <wp:docPr id="2" name="Picture 2"/>
             <wp:cNvGraphicFramePr>
               <a:graphicFrameLocks noChangeAspect="1"/>
@@ -855,7 +855,7 @@
                   <pic:spPr>
                     <a:xfrm>
                       <a:off x="0" y="0"/>
-                      <a:ext cx="6264000" cy="3460582"/>
+                      <a:ext cx="6264000" cy="3607320"/>
                     </a:xfrm>
                     <a:prstGeom prst="rect"/>
                   </pic:spPr>
@@ -1010,7 +1010,7 @@
       <w:r>
         <w:drawing>
           <wp:inline xmlns:a="http://schemas.openxmlformats.org/drawingml/2006/main" xmlns:pic="http://schemas.openxmlformats.org/drawingml/2006/picture">
-            <wp:extent cx="6264000" cy="2860638"/>
+            <wp:extent cx="6264000" cy="2872832"/>
             <wp:docPr id="3" name="Picture 3"/>
             <wp:cNvGraphicFramePr>
               <a:graphicFrameLocks noChangeAspect="1"/>
@@ -1031,7 +1031,7 @@
                   <pic:spPr>
                     <a:xfrm>
                       <a:off x="0" y="0"/>
-                      <a:ext cx="6264000" cy="2860638"/>
+                      <a:ext cx="6264000" cy="2872832"/>
                     </a:xfrm>
                     <a:prstGeom prst="rect"/>
                   </pic:spPr>
@@ -1101,7 +1101,7 @@
       <w:r>
         <w:drawing>
           <wp:inline xmlns:a="http://schemas.openxmlformats.org/drawingml/2006/main" xmlns:pic="http://schemas.openxmlformats.org/drawingml/2006/picture">
-            <wp:extent cx="6264000" cy="3343599"/>
+            <wp:extent cx="6264000" cy="3362530"/>
             <wp:docPr id="4" name="Picture 4"/>
             <wp:cNvGraphicFramePr>
               <a:graphicFrameLocks noChangeAspect="1"/>
@@ -1122,7 +1122,7 @@
                   <pic:spPr>
                     <a:xfrm>
                       <a:off x="0" y="0"/>
-                      <a:ext cx="6264000" cy="3343599"/>
+                      <a:ext cx="6264000" cy="3362530"/>
                     </a:xfrm>
                     <a:prstGeom prst="rect"/>
                   </pic:spPr>
@@ -1353,7 +1353,7 @@
       <w:r>
         <w:drawing>
           <wp:inline xmlns:a="http://schemas.openxmlformats.org/drawingml/2006/main" xmlns:pic="http://schemas.openxmlformats.org/drawingml/2006/picture">
-            <wp:extent cx="6264000" cy="1680208"/>
+            <wp:extent cx="6264000" cy="1695973"/>
             <wp:docPr id="5" name="Picture 5"/>
             <wp:cNvGraphicFramePr>
               <a:graphicFrameLocks noChangeAspect="1"/>
@@ -1374,7 +1374,7 @@
                   <pic:spPr>
                     <a:xfrm>
                       <a:off x="0" y="0"/>
-                      <a:ext cx="6264000" cy="1680208"/>
+                      <a:ext cx="6264000" cy="1695973"/>
                     </a:xfrm>
                     <a:prstGeom prst="rect"/>
                   </pic:spPr>
@@ -1496,7 +1496,7 @@
       <w:r>
         <w:drawing>
           <wp:inline xmlns:a="http://schemas.openxmlformats.org/drawingml/2006/main" xmlns:pic="http://schemas.openxmlformats.org/drawingml/2006/picture">
-            <wp:extent cx="6264000" cy="2848912"/>
+            <wp:extent cx="6264000" cy="2870849"/>
             <wp:docPr id="6" name="Picture 6"/>
             <wp:cNvGraphicFramePr>
               <a:graphicFrameLocks noChangeAspect="1"/>
@@ -1517,7 +1517,7 @@
                   <pic:spPr>
                     <a:xfrm>
                       <a:off x="0" y="0"/>
-                      <a:ext cx="6264000" cy="2848912"/>
+                      <a:ext cx="6264000" cy="2870849"/>
                     </a:xfrm>
                     <a:prstGeom prst="rect"/>
                   </pic:spPr>
@@ -1809,7 +1809,7 @@
       <w:r>
         <w:drawing>
           <wp:inline xmlns:a="http://schemas.openxmlformats.org/drawingml/2006/main" xmlns:pic="http://schemas.openxmlformats.org/drawingml/2006/picture">
-            <wp:extent cx="6264000" cy="4280952"/>
+            <wp:extent cx="6264000" cy="4302228"/>
             <wp:docPr id="7" name="Picture 7"/>
             <wp:cNvGraphicFramePr>
               <a:graphicFrameLocks noChangeAspect="1"/>
@@ -1830,7 +1830,7 @@
                   <pic:spPr>
                     <a:xfrm>
                       <a:off x="0" y="0"/>
-                      <a:ext cx="6264000" cy="4280952"/>
+                      <a:ext cx="6264000" cy="4302228"/>
                     </a:xfrm>
                     <a:prstGeom prst="rect"/>
                   </pic:spPr>

</xml_diff>